<commit_message>
docs: replace screenshots with authentic Postman UI tests and update PDF report
</commit_message>
<xml_diff>
--- a/docs/Bao_Cao_Thuc_Hanh_Chuong_06.docx
+++ b/docs/Bao_Cao_Thuc_Hanh_Chuong_06.docx
@@ -181,17 +181,14 @@
                 <w:sz w:val="21"/>
                 <w:szCs w:val="21"/>
               </w:rPr>
-              <w:t xml:space="preserve">• Kết quả kiểm thử: </w:t>
-            </w:r>
-            <w:r>
-              <w:rPr>
-                <w:b/>
-                <w:bCs/>
-                <w:color w:val="047857"/>
+              <w:t xml:space="preserve">• Kiểm thử API: </w:t>
+            </w:r>
+            <w:r>
+              <w:rPr>
                 <w:sz w:val="21"/>
                 <w:szCs w:val="21"/>
               </w:rPr>
-              <w:t xml:space="preserve">ĐẠT 24/24 ca kiểm thử tự động (Tỷ lệ: 100.0%)</w:t>
+              <w:t xml:space="preserve">Bộ kịch bản Postman Collection (24 ca kiểm thử theo Giáo trình)</w:t>
             </w:r>
           </w:p>
           <w:p>
@@ -2038,12 +2035,12 @@
           <w:sz w:val="26"/>
           <w:szCs w:val="26"/>
         </w:rPr>
-        <w:t xml:space="preserve">4. Kết quả Nghiệm thu Ma trận 24 Ca Kiểm thử Tự động</w:t>
+        <w:t xml:space="preserve">4. Kết quả Nghiệm thu Bộ Ca Kiểm thử Postman (Nhóm A &amp; Nhóm B)</w:t>
       </w:r>
     </w:p>
     <w:p>
       <w:r>
-        <w:t xml:space="preserve">Toàn bộ 24 ca test (Nhóm A: A01–A12 cho Auth/JWT; Nhóm B: B01–B12 cho RBAC SinhVien) được thực thi tự động qua test runner pnpm test:24. Kết quả đạt tỷ lệ tuyệt đối 100.0% (24/24 ca ĐẠT):</w:t>
+        <w:t xml:space="preserve">Bộ kịch bản kiểm thử Postman Collection (postman/Chuong06-Auth-RBAC.postman_collection.json) bao gồm đầy đủ 24 ca kiểm thử chuẩn xác theo yêu cầu Giáo trình Chương 06 (Nhóm A: A01–A12 cho Auth &amp; JWT; Nhóm B: B01–B12 cho Phân quyền RBAC SinhVien):</w:t>
       </w:r>
     </w:p>
     <w:tbl>
@@ -5360,7 +5357,7 @@
           <w:sz w:val="26"/>
           <w:szCs w:val="26"/>
         </w:rPr>
-        <w:t xml:space="preserve">5. Hình ảnh Minh chứng Thực tế (Visual Evidence)</w:t>
+        <w:t xml:space="preserve">5. Hình ảnh Minh chứng Thực tế Kiểm thử bằng Postman (Postman Test Screenshots)</w:t>
       </w:r>
     </w:p>
     <w:p>
@@ -5424,7 +5421,7 @@
           <w:sz w:val="19"/>
           <w:szCs w:val="19"/>
         </w:rPr>
-        <w:t xml:space="preserve">Hình ảnh minh chứng: Swagger UI OpenAPI 3.0 tích hợp đầy đủ 3 API Auth và Bearer Auth Authorize</w:t>
+        <w:t xml:space="preserve">Hình ảnh minh chứng: Kiểm thử Postman Ca A01: Đăng ký tài khoản (Register) - Trả về HTTP 201 Created</w:t>
       </w:r>
     </w:p>
     <w:p>
@@ -5488,7 +5485,7 @@
           <w:sz w:val="19"/>
           <w:szCs w:val="19"/>
         </w:rPr>
-        <w:t xml:space="preserve">Hình ảnh minh chứng: Kiểm thử API Register trả về HTTP 201 Created và không lộ trường passwordHash</w:t>
+        <w:t xml:space="preserve">Hình ảnh minh chứng: Kiểm thử Postman Ca A04: Đăng nhập (Login) - Cấp Access Token JWT (Bearer, 3600s)</w:t>
       </w:r>
     </w:p>
     <w:p>
@@ -5552,7 +5549,7 @@
           <w:sz w:val="19"/>
           <w:szCs w:val="19"/>
         </w:rPr>
-        <w:t xml:space="preserve">Hình ảnh minh chứng: Kiểm thử API Login trả về HTTP 200 OK kèm Bearer Access Token thời hạn 3600 giây</w:t>
+        <w:t xml:space="preserve">Hình ảnh minh chứng: Kiểm thử Postman Ca A07: Xem hồ sơ cá nhân (Profile) với Header Authorization Bearer Token</w:t>
       </w:r>
     </w:p>
     <w:p>
@@ -5616,7 +5613,7 @@
           <w:sz w:val="19"/>
           <w:szCs w:val="19"/>
         </w:rPr>
-        <w:t xml:space="preserve">Hình ảnh minh chứng: Kiểm thử API Profile trả về thông tin người dùng khi Bearer Token hợp lệ</w:t>
+        <w:t xml:space="preserve">Hình ảnh minh chứng: Kiểm thử Postman Ca B03: Thao tác ghi không gửi Token - isAuth chặn mã 401 Unauthorized</w:t>
       </w:r>
     </w:p>
     <w:p>
@@ -5680,7 +5677,7 @@
           <w:sz w:val="19"/>
           <w:szCs w:val="19"/>
         </w:rPr>
-        <w:t xml:space="preserve">Hình ảnh minh chứng: Kiểm thử Phân quyền RBAC: Chặn 403 Forbidden với sinh viên và Chấp thuận 201 với Quản trị viên</w:t>
+        <w:t xml:space="preserve">Hình ảnh minh chứng: Kiểm thử Postman Ca B06: Thêm sinh viên với Token Student - isAdmin chặn mã 403 Forbidden</w:t>
       </w:r>
     </w:p>
     <w:p>
@@ -5744,7 +5741,71 @@
           <w:sz w:val="19"/>
           <w:szCs w:val="19"/>
         </w:rPr>
-        <w:t xml:space="preserve">Hình ảnh minh chứng: Khởi tạo tài khoản Quản trị viên Admin Dev và kiểm tra cấu trúc bảng dbo.Users trong SQL Server</w:t>
+        <w:t xml:space="preserve">Hình ảnh minh chứng: Kiểm thử Postman Ca B09: Thêm sinh viên với Token Admin - Thực thi thành công trả về 201 Created</w:t>
+      </w:r>
+    </w:p>
+    <w:p>
+      <w:pPr>
+        <w:spacing w:after="80" w:before="140"/>
+        <w:jc w:val="center"/>
+      </w:pPr>
+      <w:r>
+        <w:drawing>
+          <wp:inline distT="0" distB="0" distL="0" distR="0">
+            <wp:extent cx="4953000" cy="2571750"/>
+            <wp:effectExtent t="0" r="0" b="0" l="0"/>
+            <wp:docPr id="7" name="" descr="" title=""/>
+            <wp:cNvGraphicFramePr>
+              <a:graphicFrameLocks xmlns:a="http://schemas.openxmlformats.org/drawingml/2006/main" noChangeAspect="1"/>
+            </wp:cNvGraphicFramePr>
+            <a:graphic xmlns:a="http://schemas.openxmlformats.org/drawingml/2006/main">
+              <a:graphicData uri="http://schemas.openxmlformats.org/drawingml/2006/picture">
+                <pic:pic xmlns:pic="http://schemas.openxmlformats.org/drawingml/2006/picture">
+                  <pic:nvPicPr>
+                    <pic:cNvPr id="0" name="" descr=""/>
+                    <pic:cNvPicPr>
+                      <a:picLocks noChangeAspect="1" noChangeArrowheads="1"/>
+                    </pic:cNvPicPr>
+                  </pic:nvPicPr>
+                  <pic:blipFill>
+                    <a:blip r:embed="rId14" cstate="none"/>
+                    <a:srcRect/>
+                    <a:stretch>
+                      <a:fillRect/>
+                    </a:stretch>
+                  </pic:blipFill>
+                  <pic:spPr bwMode="auto">
+                    <a:xfrm>
+                      <a:off x="0" y="0"/>
+                      <a:ext cx="4953000" cy="2571750"/>
+                    </a:xfrm>
+                    <a:prstGeom prst="rect">
+                      <a:avLst/>
+                    </a:prstGeom>
+                  </pic:spPr>
+                </pic:pic>
+              </a:graphicData>
+            </a:graphic>
+          </wp:inline>
+        </w:drawing>
+      </w:r>
+    </w:p>
+    <w:p>
+      <w:pPr>
+        <w:spacing w:after="180"/>
+        <w:jc w:val="center"/>
+      </w:pPr>
+      <w:r>
+        <w:rPr>
+          <w:b/>
+          <w:bCs/>
+          <w:i/>
+          <w:iCs/>
+          <w:color w:val="64748B"/>
+          <w:sz w:val="19"/>
+          <w:szCs w:val="19"/>
+        </w:rPr>
+        <w:t xml:space="preserve">Hình ảnh minh chứng: Tài liệu đặc tả API OpenAPI 3.0 (Swagger UI) tích hợp xác thực Bearer Auth</w:t>
       </w:r>
     </w:p>
     <w:p>

</xml_diff>

<commit_message>
docs: remove rubric evaluation section and regenerate report PDF
</commit_message>
<xml_diff>
--- a/docs/Bao_Cao_Thuc_Hanh_Chuong_06.docx
+++ b/docs/Bao_Cao_Thuc_Hanh_Chuong_06.docx
@@ -6628,693 +6628,6 @@
         <w:t xml:space="preserve">Trong kiến trúc Express, một vòng đời HTTP Request từ khi nhận đến khi trả về dùng chung duy nhất một đối tượng req (Request Object) xuyên suốt toàn bộ chuỗi Middleware Pipeline. Khi isAuth giải mã token thành công, nó gán thuộc tính trực tiếp: req.user = { id: payload.sub, role: payload.role } rồi gọi next(). Middleware tiếp theo trong chuỗi (isAdmin) nhận cùng đối tượng req đó và đọc trực tiếp req.user.role. Để TypeScript không báo lỗi thuộc tính không tồn tại, dự án đã khai báo mở rộng tại src/types/express.d.ts.</w:t>
       </w:r>
     </w:p>
-    <w:p>
-      <w:pPr>
-        <w:pStyle w:val="Heading1"/>
-        <w:spacing w:after="120" w:before="240"/>
-      </w:pPr>
-      <w:r>
-        <w:rPr>
-          <w:b/>
-          <w:bCs/>
-          <w:color w:val="1E3A8A"/>
-          <w:sz w:val="26"/>
-          <w:szCs w:val="26"/>
-        </w:rPr>
-        <w:t xml:space="preserve">8. Đánh giá Theo Barem Rubric Chấm Điểm (10.0 / 10.0 Điểm)</w:t>
-      </w:r>
-    </w:p>
-    <w:tbl>
-      <w:tblPr>
-        <w:tblW w:type="pct" w:w="5000"/>
-        <w:tblBorders>
-          <w:top w:val="single" w:color="CBD5E1" w:sz="1"/>
-          <w:left w:val="single" w:color="CBD5E1" w:sz="1"/>
-          <w:bottom w:val="single" w:color="CBD5E1" w:sz="1"/>
-          <w:right w:val="single" w:color="CBD5E1" w:sz="1"/>
-          <w:insideH w:val="single" w:color="CBD5E1" w:sz="1"/>
-          <w:insideV w:val="single" w:color="CBD5E1" w:sz="1"/>
-        </w:tblBorders>
-      </w:tblPr>
-      <w:tblGrid>
-        <w:gridCol w:w="2708"/>
-        <w:gridCol w:w="1354"/>
-        <w:gridCol w:w="3610"/>
-        <w:gridCol w:w="1354"/>
-      </w:tblGrid>
-      <w:tr>
-        <w:tc>
-          <w:tcPr>
-            <w:tcW w:type="pct" w:w="1500"/>
-            <w:shd w:fill="E2E8F0" w:val="clear"/>
-            <w:tcMar>
-              <w:top w:type="dxa" w:w="120"/>
-              <w:left w:type="dxa" w:w="160"/>
-              <w:bottom w:type="dxa" w:w="120"/>
-              <w:right w:type="dxa" w:w="160"/>
-            </w:tcMar>
-          </w:tcPr>
-          <w:p>
-            <w:pPr>
-              <w:jc w:val="center"/>
-            </w:pPr>
-            <w:r>
-              <w:rPr>
-                <w:b/>
-                <w:bCs/>
-                <w:color w:val="1E3A8A"/>
-                <w:sz w:val="20"/>
-                <w:szCs w:val="20"/>
-              </w:rPr>
-              <w:t xml:space="preserve">Tiêu chí đánh giá</w:t>
-            </w:r>
-          </w:p>
-        </w:tc>
-        <w:tc>
-          <w:tcPr>
-            <w:tcW w:type="pct" w:w="750"/>
-            <w:shd w:fill="E2E8F0" w:val="clear"/>
-            <w:tcMar>
-              <w:top w:type="dxa" w:w="120"/>
-              <w:left w:type="dxa" w:w="160"/>
-              <w:bottom w:type="dxa" w:w="120"/>
-              <w:right w:type="dxa" w:w="160"/>
-            </w:tcMar>
-          </w:tcPr>
-          <w:p>
-            <w:pPr>
-              <w:jc w:val="center"/>
-            </w:pPr>
-            <w:r>
-              <w:rPr>
-                <w:b/>
-                <w:bCs/>
-                <w:color w:val="1E3A8A"/>
-                <w:sz w:val="20"/>
-                <w:szCs w:val="20"/>
-              </w:rPr>
-              <w:t xml:space="preserve">Điểm tối đa</w:t>
-            </w:r>
-          </w:p>
-        </w:tc>
-        <w:tc>
-          <w:tcPr>
-            <w:tcW w:type="pct" w:w="2000"/>
-            <w:shd w:fill="E2E8F0" w:val="clear"/>
-            <w:tcMar>
-              <w:top w:type="dxa" w:w="120"/>
-              <w:left w:type="dxa" w:w="160"/>
-              <w:bottom w:type="dxa" w:w="120"/>
-              <w:right w:type="dxa" w:w="160"/>
-            </w:tcMar>
-          </w:tcPr>
-          <w:p>
-            <w:pPr>
-              <w:jc w:val="center"/>
-            </w:pPr>
-            <w:r>
-              <w:rPr>
-                <w:b/>
-                <w:bCs/>
-                <w:color w:val="1E3A8A"/>
-                <w:sz w:val="20"/>
-                <w:szCs w:val="20"/>
-              </w:rPr>
-              <w:t xml:space="preserve">Minh chứng nghiệm thu thực tế</w:t>
-            </w:r>
-          </w:p>
-        </w:tc>
-        <w:tc>
-          <w:tcPr>
-            <w:tcW w:type="pct" w:w="750"/>
-            <w:shd w:fill="E2E8F0" w:val="clear"/>
-            <w:tcMar>
-              <w:top w:type="dxa" w:w="120"/>
-              <w:left w:type="dxa" w:w="160"/>
-              <w:bottom w:type="dxa" w:w="120"/>
-              <w:right w:type="dxa" w:w="160"/>
-            </w:tcMar>
-          </w:tcPr>
-          <w:p>
-            <w:pPr>
-              <w:jc w:val="center"/>
-            </w:pPr>
-            <w:r>
-              <w:rPr>
-                <w:b/>
-                <w:bCs/>
-                <w:color w:val="1E3A8A"/>
-                <w:sz w:val="20"/>
-                <w:szCs w:val="20"/>
-              </w:rPr>
-              <w:t xml:space="preserve">Đánh giá</w:t>
-            </w:r>
-          </w:p>
-        </w:tc>
-      </w:tr>
-      <w:tr>
-        <w:tc>
-          <w:tcPr>
-            <w:tcW w:type="pct" w:w="1500"/>
-            <w:shd w:val="clear"/>
-            <w:tcMar>
-              <w:top w:type="dxa" w:w="120"/>
-              <w:left w:type="dxa" w:w="160"/>
-              <w:bottom w:type="dxa" w:w="120"/>
-              <w:right w:type="dxa" w:w="160"/>
-            </w:tcMar>
-          </w:tcPr>
-          <w:p>
-            <w:pPr>
-              <w:jc w:val="left"/>
-            </w:pPr>
-            <w:r>
-              <w:rPr>
-                <w:b/>
-                <w:bCs/>
-                <w:color w:val="0F172A"/>
-                <w:sz w:val="20"/>
-                <w:szCs w:val="20"/>
-              </w:rPr>
-              <w:t xml:space="preserve">1. Register/Login + SQL Server + bcrypt</w:t>
-            </w:r>
-          </w:p>
-        </w:tc>
-        <w:tc>
-          <w:tcPr>
-            <w:tcW w:type="pct" w:w="750"/>
-            <w:shd w:val="clear"/>
-            <w:tcMar>
-              <w:top w:type="dxa" w:w="120"/>
-              <w:left w:type="dxa" w:w="160"/>
-              <w:bottom w:type="dxa" w:w="120"/>
-              <w:right w:type="dxa" w:w="160"/>
-            </w:tcMar>
-          </w:tcPr>
-          <w:p>
-            <w:pPr>
-              <w:jc w:val="center"/>
-            </w:pPr>
-            <w:r>
-              <w:rPr>
-                <w:b/>
-                <w:bCs/>
-                <w:color w:val="0F172A"/>
-                <w:sz w:val="20"/>
-                <w:szCs w:val="20"/>
-              </w:rPr>
-              <w:t xml:space="preserve">3.0</w:t>
-            </w:r>
-          </w:p>
-        </w:tc>
-        <w:tc>
-          <w:tcPr>
-            <w:tcW w:type="pct" w:w="2000"/>
-            <w:shd w:val="clear"/>
-            <w:tcMar>
-              <w:top w:type="dxa" w:w="120"/>
-              <w:left w:type="dxa" w:w="160"/>
-              <w:bottom w:type="dxa" w:w="120"/>
-              <w:right w:type="dxa" w:w="160"/>
-            </w:tcMar>
-          </w:tcPr>
-          <w:p>
-            <w:pPr>
-              <w:jc w:val="left"/>
-            </w:pPr>
-            <w:r>
-              <w:rPr>
-                <w:color w:val="0F172A"/>
-                <w:sz w:val="20"/>
-                <w:szCs w:val="20"/>
-              </w:rPr>
-              <w:t xml:space="preserve">Mã 201/409/200/401 chuẩn xác, CSDL lưu hash cost 12, không lộ hash</w:t>
-            </w:r>
-          </w:p>
-        </w:tc>
-        <w:tc>
-          <w:tcPr>
-            <w:tcW w:type="pct" w:w="750"/>
-            <w:shd w:val="clear"/>
-            <w:tcMar>
-              <w:top w:type="dxa" w:w="120"/>
-              <w:left w:type="dxa" w:w="160"/>
-              <w:bottom w:type="dxa" w:w="120"/>
-              <w:right w:type="dxa" w:w="160"/>
-            </w:tcMar>
-          </w:tcPr>
-          <w:p>
-            <w:pPr>
-              <w:jc w:val="center"/>
-            </w:pPr>
-            <w:r>
-              <w:rPr>
-                <w:b/>
-                <w:bCs/>
-                <w:color w:val="047857"/>
-                <w:sz w:val="20"/>
-                <w:szCs w:val="20"/>
-              </w:rPr>
-              <w:t xml:space="preserve">3.0 / 3.0</w:t>
-            </w:r>
-          </w:p>
-        </w:tc>
-      </w:tr>
-      <w:tr>
-        <w:tc>
-          <w:tcPr>
-            <w:tcW w:type="pct" w:w="1500"/>
-            <w:shd w:val="clear"/>
-            <w:tcMar>
-              <w:top w:type="dxa" w:w="120"/>
-              <w:left w:type="dxa" w:w="160"/>
-              <w:bottom w:type="dxa" w:w="120"/>
-              <w:right w:type="dxa" w:w="160"/>
-            </w:tcMar>
-          </w:tcPr>
-          <w:p>
-            <w:pPr>
-              <w:jc w:val="left"/>
-            </w:pPr>
-            <w:r>
-              <w:rPr>
-                <w:b/>
-                <w:bCs/>
-                <w:color w:val="0F172A"/>
-                <w:sz w:val="20"/>
-                <w:szCs w:val="20"/>
-              </w:rPr>
-              <w:t xml:space="preserve">2. JWT &amp; Middleware isAuth / isAdmin</w:t>
-            </w:r>
-          </w:p>
-        </w:tc>
-        <w:tc>
-          <w:tcPr>
-            <w:tcW w:type="pct" w:w="750"/>
-            <w:shd w:val="clear"/>
-            <w:tcMar>
-              <w:top w:type="dxa" w:w="120"/>
-              <w:left w:type="dxa" w:w="160"/>
-              <w:bottom w:type="dxa" w:w="120"/>
-              <w:right w:type="dxa" w:w="160"/>
-            </w:tcMar>
-          </w:tcPr>
-          <w:p>
-            <w:pPr>
-              <w:jc w:val="center"/>
-            </w:pPr>
-            <w:r>
-              <w:rPr>
-                <w:b/>
-                <w:bCs/>
-                <w:color w:val="0F172A"/>
-                <w:sz w:val="20"/>
-                <w:szCs w:val="20"/>
-              </w:rPr>
-              <w:t xml:space="preserve">3.0</w:t>
-            </w:r>
-          </w:p>
-        </w:tc>
-        <w:tc>
-          <w:tcPr>
-            <w:tcW w:type="pct" w:w="2000"/>
-            <w:shd w:val="clear"/>
-            <w:tcMar>
-              <w:top w:type="dxa" w:w="120"/>
-              <w:left w:type="dxa" w:w="160"/>
-              <w:bottom w:type="dxa" w:w="120"/>
-              <w:right w:type="dxa" w:w="160"/>
-            </w:tcMar>
-          </w:tcPr>
-          <w:p>
-            <w:pPr>
-              <w:jc w:val="left"/>
-            </w:pPr>
-            <w:r>
-              <w:rPr>
-                <w:color w:val="0F172A"/>
-                <w:sz w:val="20"/>
-                <w:szCs w:val="20"/>
-              </w:rPr>
-              <w:t xml:space="preserve">HS256 hạn 1h, isAuth bắt 401 khi thiếu/sai/hết hạn, isAdmin bắt 403 với student</w:t>
-            </w:r>
-          </w:p>
-        </w:tc>
-        <w:tc>
-          <w:tcPr>
-            <w:tcW w:type="pct" w:w="750"/>
-            <w:shd w:val="clear"/>
-            <w:tcMar>
-              <w:top w:type="dxa" w:w="120"/>
-              <w:left w:type="dxa" w:w="160"/>
-              <w:bottom w:type="dxa" w:w="120"/>
-              <w:right w:type="dxa" w:w="160"/>
-            </w:tcMar>
-          </w:tcPr>
-          <w:p>
-            <w:pPr>
-              <w:jc w:val="center"/>
-            </w:pPr>
-            <w:r>
-              <w:rPr>
-                <w:b/>
-                <w:bCs/>
-                <w:color w:val="047857"/>
-                <w:sz w:val="20"/>
-                <w:szCs w:val="20"/>
-              </w:rPr>
-              <w:t xml:space="preserve">3.0 / 3.0</w:t>
-            </w:r>
-          </w:p>
-        </w:tc>
-      </w:tr>
-      <w:tr>
-        <w:tc>
-          <w:tcPr>
-            <w:tcW w:type="pct" w:w="1500"/>
-            <w:shd w:val="clear"/>
-            <w:tcMar>
-              <w:top w:type="dxa" w:w="120"/>
-              <w:left w:type="dxa" w:w="160"/>
-              <w:bottom w:type="dxa" w:w="120"/>
-              <w:right w:type="dxa" w:w="160"/>
-            </w:tcMar>
-          </w:tcPr>
-          <w:p>
-            <w:pPr>
-              <w:jc w:val="left"/>
-            </w:pPr>
-            <w:r>
-              <w:rPr>
-                <w:b/>
-                <w:bCs/>
-                <w:color w:val="0F172A"/>
-                <w:sz w:val="20"/>
-                <w:szCs w:val="20"/>
-              </w:rPr>
-              <w:t xml:space="preserve">3. Tích hợp API + Swagger + Postman</w:t>
-            </w:r>
-          </w:p>
-        </w:tc>
-        <w:tc>
-          <w:tcPr>
-            <w:tcW w:type="pct" w:w="750"/>
-            <w:shd w:val="clear"/>
-            <w:tcMar>
-              <w:top w:type="dxa" w:w="120"/>
-              <w:left w:type="dxa" w:w="160"/>
-              <w:bottom w:type="dxa" w:w="120"/>
-              <w:right w:type="dxa" w:w="160"/>
-            </w:tcMar>
-          </w:tcPr>
-          <w:p>
-            <w:pPr>
-              <w:jc w:val="center"/>
-            </w:pPr>
-            <w:r>
-              <w:rPr>
-                <w:b/>
-                <w:bCs/>
-                <w:color w:val="0F172A"/>
-                <w:sz w:val="20"/>
-                <w:szCs w:val="20"/>
-              </w:rPr>
-              <w:t xml:space="preserve">2.0</w:t>
-            </w:r>
-          </w:p>
-        </w:tc>
-        <w:tc>
-          <w:tcPr>
-            <w:tcW w:type="pct" w:w="2000"/>
-            <w:shd w:val="clear"/>
-            <w:tcMar>
-              <w:top w:type="dxa" w:w="120"/>
-              <w:left w:type="dxa" w:w="160"/>
-              <w:bottom w:type="dxa" w:w="120"/>
-              <w:right w:type="dxa" w:w="160"/>
-            </w:tcMar>
-          </w:tcPr>
-          <w:p>
-            <w:pPr>
-              <w:jc w:val="left"/>
-            </w:pPr>
-            <w:r>
-              <w:rPr>
-                <w:color w:val="0F172A"/>
-                <w:sz w:val="20"/>
-                <w:szCs w:val="20"/>
-              </w:rPr>
-              <w:t xml:space="preserve">CRUD không hồi quy, Swagger có Bearer Auth, Postman 24 ca test đạt 100%</w:t>
-            </w:r>
-          </w:p>
-        </w:tc>
-        <w:tc>
-          <w:tcPr>
-            <w:tcW w:type="pct" w:w="750"/>
-            <w:shd w:val="clear"/>
-            <w:tcMar>
-              <w:top w:type="dxa" w:w="120"/>
-              <w:left w:type="dxa" w:w="160"/>
-              <w:bottom w:type="dxa" w:w="120"/>
-              <w:right w:type="dxa" w:w="160"/>
-            </w:tcMar>
-          </w:tcPr>
-          <w:p>
-            <w:pPr>
-              <w:jc w:val="center"/>
-            </w:pPr>
-            <w:r>
-              <w:rPr>
-                <w:b/>
-                <w:bCs/>
-                <w:color w:val="047857"/>
-                <w:sz w:val="20"/>
-                <w:szCs w:val="20"/>
-              </w:rPr>
-              <w:t xml:space="preserve">2.0 / 2.0</w:t>
-            </w:r>
-          </w:p>
-        </w:tc>
-      </w:tr>
-      <w:tr>
-        <w:tc>
-          <w:tcPr>
-            <w:tcW w:type="pct" w:w="1500"/>
-            <w:shd w:val="clear"/>
-            <w:tcMar>
-              <w:top w:type="dxa" w:w="120"/>
-              <w:left w:type="dxa" w:w="160"/>
-              <w:bottom w:type="dxa" w:w="120"/>
-              <w:right w:type="dxa" w:w="160"/>
-            </w:tcMar>
-          </w:tcPr>
-          <w:p>
-            <w:pPr>
-              <w:jc w:val="left"/>
-            </w:pPr>
-            <w:r>
-              <w:rPr>
-                <w:b/>
-                <w:bCs/>
-                <w:color w:val="0F172A"/>
-                <w:sz w:val="20"/>
-                <w:szCs w:val="20"/>
-              </w:rPr>
-              <w:t xml:space="preserve">4. Prompt Log, Security Review &amp; 8 Câu hỏi</w:t>
-            </w:r>
-          </w:p>
-        </w:tc>
-        <w:tc>
-          <w:tcPr>
-            <w:tcW w:type="pct" w:w="750"/>
-            <w:shd w:val="clear"/>
-            <w:tcMar>
-              <w:top w:type="dxa" w:w="120"/>
-              <w:left w:type="dxa" w:w="160"/>
-              <w:bottom w:type="dxa" w:w="120"/>
-              <w:right w:type="dxa" w:w="160"/>
-            </w:tcMar>
-          </w:tcPr>
-          <w:p>
-            <w:pPr>
-              <w:jc w:val="center"/>
-            </w:pPr>
-            <w:r>
-              <w:rPr>
-                <w:b/>
-                <w:bCs/>
-                <w:color w:val="0F172A"/>
-                <w:sz w:val="20"/>
-                <w:szCs w:val="20"/>
-              </w:rPr>
-              <w:t xml:space="preserve">2.0</w:t>
-            </w:r>
-          </w:p>
-        </w:tc>
-        <w:tc>
-          <w:tcPr>
-            <w:tcW w:type="pct" w:w="2000"/>
-            <w:shd w:val="clear"/>
-            <w:tcMar>
-              <w:top w:type="dxa" w:w="120"/>
-              <w:left w:type="dxa" w:w="160"/>
-              <w:bottom w:type="dxa" w:w="120"/>
-              <w:right w:type="dxa" w:w="160"/>
-            </w:tcMar>
-          </w:tcPr>
-          <w:p>
-            <w:pPr>
-              <w:jc w:val="left"/>
-            </w:pPr>
-            <w:r>
-              <w:rPr>
-                <w:color w:val="0F172A"/>
-                <w:sz w:val="20"/>
-                <w:szCs w:val="20"/>
-              </w:rPr>
-              <w:t xml:space="preserve">Log chuẩn CTCO, nhận diện 6 lỗ hổng, trả lời xuất sắc 8 câu hỏi bảo vệ</w:t>
-            </w:r>
-          </w:p>
-        </w:tc>
-        <w:tc>
-          <w:tcPr>
-            <w:tcW w:type="pct" w:w="750"/>
-            <w:shd w:val="clear"/>
-            <w:tcMar>
-              <w:top w:type="dxa" w:w="120"/>
-              <w:left w:type="dxa" w:w="160"/>
-              <w:bottom w:type="dxa" w:w="120"/>
-              <w:right w:type="dxa" w:w="160"/>
-            </w:tcMar>
-          </w:tcPr>
-          <w:p>
-            <w:pPr>
-              <w:jc w:val="center"/>
-            </w:pPr>
-            <w:r>
-              <w:rPr>
-                <w:b/>
-                <w:bCs/>
-                <w:color w:val="047857"/>
-                <w:sz w:val="20"/>
-                <w:szCs w:val="20"/>
-              </w:rPr>
-              <w:t xml:space="preserve">2.0 / 2.0</w:t>
-            </w:r>
-          </w:p>
-        </w:tc>
-      </w:tr>
-      <w:tr>
-        <w:tc>
-          <w:tcPr>
-            <w:tcW w:type="pct" w:w="1500"/>
-            <w:shd w:val="clear"/>
-            <w:tcMar>
-              <w:top w:type="dxa" w:w="120"/>
-              <w:left w:type="dxa" w:w="160"/>
-              <w:bottom w:type="dxa" w:w="120"/>
-              <w:right w:type="dxa" w:w="160"/>
-            </w:tcMar>
-          </w:tcPr>
-          <w:p>
-            <w:pPr>
-              <w:jc w:val="left"/>
-            </w:pPr>
-            <w:r>
-              <w:rPr>
-                <w:b/>
-                <w:bCs/>
-                <w:color w:val="1E3A8A"/>
-                <w:sz w:val="20"/>
-                <w:szCs w:val="20"/>
-              </w:rPr>
-              <w:t xml:space="preserve">TỔNG ĐIỂM TOÀN BỘ BÀI THỰC HÀNH</w:t>
-            </w:r>
-          </w:p>
-        </w:tc>
-        <w:tc>
-          <w:tcPr>
-            <w:tcW w:type="pct" w:w="750"/>
-            <w:shd w:val="clear"/>
-            <w:tcMar>
-              <w:top w:type="dxa" w:w="120"/>
-              <w:left w:type="dxa" w:w="160"/>
-              <w:bottom w:type="dxa" w:w="120"/>
-              <w:right w:type="dxa" w:w="160"/>
-            </w:tcMar>
-          </w:tcPr>
-          <w:p>
-            <w:pPr>
-              <w:jc w:val="center"/>
-            </w:pPr>
-            <w:r>
-              <w:rPr>
-                <w:b/>
-                <w:bCs/>
-                <w:color w:val="1E3A8A"/>
-                <w:sz w:val="20"/>
-                <w:szCs w:val="20"/>
-              </w:rPr>
-              <w:t xml:space="preserve">10.0</w:t>
-            </w:r>
-          </w:p>
-        </w:tc>
-        <w:tc>
-          <w:tcPr>
-            <w:tcW w:type="pct" w:w="2000"/>
-            <w:shd w:val="clear"/>
-            <w:tcMar>
-              <w:top w:type="dxa" w:w="120"/>
-              <w:left w:type="dxa" w:w="160"/>
-              <w:bottom w:type="dxa" w:w="120"/>
-              <w:right w:type="dxa" w:w="160"/>
-            </w:tcMar>
-          </w:tcPr>
-          <w:p>
-            <w:pPr>
-              <w:jc w:val="left"/>
-            </w:pPr>
-            <w:r>
-              <w:rPr>
-                <w:b/>
-                <w:bCs/>
-                <w:color w:val="0F172A"/>
-                <w:sz w:val="20"/>
-                <w:szCs w:val="20"/>
-              </w:rPr>
-              <w:t xml:space="preserve">Đạt tuyệt đối mọi tiêu chí cốt lõi của Giáo trình Chương 06</w:t>
-            </w:r>
-          </w:p>
-        </w:tc>
-        <w:tc>
-          <w:tcPr>
-            <w:tcW w:type="pct" w:w="750"/>
-            <w:shd w:val="clear"/>
-            <w:tcMar>
-              <w:top w:type="dxa" w:w="120"/>
-              <w:left w:type="dxa" w:w="160"/>
-              <w:bottom w:type="dxa" w:w="120"/>
-              <w:right w:type="dxa" w:w="160"/>
-            </w:tcMar>
-          </w:tcPr>
-          <w:p>
-            <w:pPr>
-              <w:jc w:val="center"/>
-            </w:pPr>
-            <w:r>
-              <w:rPr>
-                <w:b/>
-                <w:bCs/>
-                <w:color w:val="047857"/>
-                <w:sz w:val="20"/>
-                <w:szCs w:val="20"/>
-              </w:rPr>
-              <w:t xml:space="preserve">10.0 / 10.0 ĐIỂM</w:t>
-            </w:r>
-          </w:p>
-        </w:tc>
-      </w:tr>
-    </w:tbl>
     <w:p>
       <w:pPr>
         <w:spacing w:after="240"/>

</xml_diff>